<commit_message>
Embed ddd screenshots into Task 3 Word report document
</commit_message>
<xml_diff>
--- a/Portfolio WP2/3_Unjuk_Kerja Melakukan Debugging - Nugraha Jody.docx
+++ b/Portfolio WP2/3_Unjuk_Kerja Melakukan Debugging - Nugraha Jody.docx
@@ -158,16 +158,56 @@
     </w:tbl>
     <w:p>
       <w:pPr>
-        <w:spacing w:before="160"/>
+        <w:spacing w:before="160" w:after="160"/>
+        <w:jc w:val="center"/>
+      </w:pPr>
+      <w:r>
+        <w:drawing>
+          <wp:inline xmlns:a="http://schemas.openxmlformats.org/drawingml/2006/main" xmlns:pic="http://schemas.openxmlformats.org/drawingml/2006/picture">
+            <wp:extent cx="4754880" cy="2577108"/>
+            <wp:docPr id="1" name="Picture 1"/>
+            <wp:cNvGraphicFramePr>
+              <a:graphicFrameLocks noChangeAspect="1"/>
+            </wp:cNvGraphicFramePr>
+            <a:graphic>
+              <a:graphicData uri="http://schemas.openxmlformats.org/drawingml/2006/picture">
+                <pic:pic>
+                  <pic:nvPicPr>
+                    <pic:cNvPr id="0" name="media__1783246261504.png"/>
+                    <pic:cNvPicPr/>
+                  </pic:nvPicPr>
+                  <pic:blipFill>
+                    <a:blip r:embed="rId9"/>
+                    <a:stretch>
+                      <a:fillRect/>
+                    </a:stretch>
+                  </pic:blipFill>
+                  <pic:spPr>
+                    <a:xfrm>
+                      <a:off x="0" y="0"/>
+                      <a:ext cx="4754880" cy="2577108"/>
+                    </a:xfrm>
+                    <a:prstGeom prst="rect"/>
+                  </pic:spPr>
+                </pic:pic>
+              </a:graphicData>
+            </a:graphic>
+          </wp:inline>
+        </w:drawing>
+      </w:r>
+    </w:p>
+    <w:p>
+      <w:pPr>
         <w:jc w:val="center"/>
       </w:pPr>
       <w:r>
         <w:rPr>
           <w:rFonts w:ascii="Arial" w:hAnsi="Arial"/>
-          <w:b/>
-          <w:color w:val="EF4444"/>
+          <w:i/>
+          <w:color w:val="64748B"/>
+          <w:sz w:val="18"/>
         </w:rPr>
-        <w:t>[ TEMPEL SCREENSHOT: KODE VS CODE ddd($request) DI SINI ]</w:t>
+        <w:t>(Screenshot Kode VS Code ddd)</w:t>
       </w:r>
     </w:p>
     <w:p>
@@ -176,12 +216,52 @@
         <w:jc w:val="center"/>
       </w:pPr>
       <w:r>
+        <w:drawing>
+          <wp:inline xmlns:a="http://schemas.openxmlformats.org/drawingml/2006/main" xmlns:pic="http://schemas.openxmlformats.org/drawingml/2006/picture">
+            <wp:extent cx="4754880" cy="2526030"/>
+            <wp:docPr id="2" name="Picture 2"/>
+            <wp:cNvGraphicFramePr>
+              <a:graphicFrameLocks noChangeAspect="1"/>
+            </wp:cNvGraphicFramePr>
+            <a:graphic>
+              <a:graphicData uri="http://schemas.openxmlformats.org/drawingml/2006/picture">
+                <pic:pic>
+                  <pic:nvPicPr>
+                    <pic:cNvPr id="0" name="media__1783246371379.png"/>
+                    <pic:cNvPicPr/>
+                  </pic:nvPicPr>
+                  <pic:blipFill>
+                    <a:blip r:embed="rId10"/>
+                    <a:stretch>
+                      <a:fillRect/>
+                    </a:stretch>
+                  </pic:blipFill>
+                  <pic:spPr>
+                    <a:xfrm>
+                      <a:off x="0" y="0"/>
+                      <a:ext cx="4754880" cy="2526030"/>
+                    </a:xfrm>
+                    <a:prstGeom prst="rect"/>
+                  </pic:spPr>
+                </pic:pic>
+              </a:graphicData>
+            </a:graphic>
+          </wp:inline>
+        </w:drawing>
+      </w:r>
+    </w:p>
+    <w:p>
+      <w:pPr>
+        <w:jc w:val="center"/>
+      </w:pPr>
+      <w:r>
         <w:rPr>
           <w:rFonts w:ascii="Arial" w:hAnsi="Arial"/>
-          <w:b/>
-          <w:color w:val="EF4444"/>
+          <w:i/>
+          <w:color w:val="64748B"/>
+          <w:sz w:val="18"/>
         </w:rPr>
-        <w:t>[ TEMPEL SCREENSHOT: HASIL OUTPUT HALAMAN ddd() DI BROWSER DI SINI ]</w:t>
+        <w:t>(Screenshot Halaman ddd di Browser)</w:t>
       </w:r>
     </w:p>
     <w:p>

</xml_diff>

<commit_message>
Embed dd screenshots into Task 3 Word report document
</commit_message>
<xml_diff>
--- a/Portfolio WP2/3_Unjuk_Kerja Melakukan Debugging - Nugraha Jody.docx
+++ b/Portfolio WP2/3_Unjuk_Kerja Melakukan Debugging - Nugraha Jody.docx
@@ -327,16 +327,56 @@
     </w:tbl>
     <w:p>
       <w:pPr>
-        <w:spacing w:before="160"/>
+        <w:spacing w:before="160" w:after="160"/>
+        <w:jc w:val="center"/>
+      </w:pPr>
+      <w:r>
+        <w:drawing>
+          <wp:inline xmlns:a="http://schemas.openxmlformats.org/drawingml/2006/main" xmlns:pic="http://schemas.openxmlformats.org/drawingml/2006/picture">
+            <wp:extent cx="4754880" cy="2572464"/>
+            <wp:docPr id="3" name="Picture 3"/>
+            <wp:cNvGraphicFramePr>
+              <a:graphicFrameLocks noChangeAspect="1"/>
+            </wp:cNvGraphicFramePr>
+            <a:graphic>
+              <a:graphicData uri="http://schemas.openxmlformats.org/drawingml/2006/picture">
+                <pic:pic>
+                  <pic:nvPicPr>
+                    <pic:cNvPr id="0" name="media__1783246584175.png"/>
+                    <pic:cNvPicPr/>
+                  </pic:nvPicPr>
+                  <pic:blipFill>
+                    <a:blip r:embed="rId11"/>
+                    <a:stretch>
+                      <a:fillRect/>
+                    </a:stretch>
+                  </pic:blipFill>
+                  <pic:spPr>
+                    <a:xfrm>
+                      <a:off x="0" y="0"/>
+                      <a:ext cx="4754880" cy="2572464"/>
+                    </a:xfrm>
+                    <a:prstGeom prst="rect"/>
+                  </pic:spPr>
+                </pic:pic>
+              </a:graphicData>
+            </a:graphic>
+          </wp:inline>
+        </w:drawing>
+      </w:r>
+    </w:p>
+    <w:p>
+      <w:pPr>
         <w:jc w:val="center"/>
       </w:pPr>
       <w:r>
         <w:rPr>
           <w:rFonts w:ascii="Arial" w:hAnsi="Arial"/>
-          <w:b/>
-          <w:color w:val="EF4444"/>
+          <w:i/>
+          <w:color w:val="64748B"/>
+          <w:sz w:val="18"/>
         </w:rPr>
-        <w:t>[ TEMPEL SCREENSHOT: KODE VS CODE dd($request-&gt;all()) DI SINI ]</w:t>
+        <w:t>(Screenshot Kode VS Code dd)</w:t>
       </w:r>
     </w:p>
     <w:p>
@@ -345,12 +385,52 @@
         <w:jc w:val="center"/>
       </w:pPr>
       <w:r>
+        <w:drawing>
+          <wp:inline xmlns:a="http://schemas.openxmlformats.org/drawingml/2006/main" xmlns:pic="http://schemas.openxmlformats.org/drawingml/2006/picture">
+            <wp:extent cx="4754880" cy="2516743"/>
+            <wp:docPr id="4" name="Picture 4"/>
+            <wp:cNvGraphicFramePr>
+              <a:graphicFrameLocks noChangeAspect="1"/>
+            </wp:cNvGraphicFramePr>
+            <a:graphic>
+              <a:graphicData uri="http://schemas.openxmlformats.org/drawingml/2006/picture">
+                <pic:pic>
+                  <pic:nvPicPr>
+                    <pic:cNvPr id="0" name="media__1783246637920.png"/>
+                    <pic:cNvPicPr/>
+                  </pic:nvPicPr>
+                  <pic:blipFill>
+                    <a:blip r:embed="rId12"/>
+                    <a:stretch>
+                      <a:fillRect/>
+                    </a:stretch>
+                  </pic:blipFill>
+                  <pic:spPr>
+                    <a:xfrm>
+                      <a:off x="0" y="0"/>
+                      <a:ext cx="4754880" cy="2516743"/>
+                    </a:xfrm>
+                    <a:prstGeom prst="rect"/>
+                  </pic:spPr>
+                </pic:pic>
+              </a:graphicData>
+            </a:graphic>
+          </wp:inline>
+        </w:drawing>
+      </w:r>
+    </w:p>
+    <w:p>
+      <w:pPr>
+        <w:jc w:val="center"/>
+      </w:pPr>
+      <w:r>
         <w:rPr>
           <w:rFonts w:ascii="Arial" w:hAnsi="Arial"/>
-          <w:b/>
-          <w:color w:val="EF4444"/>
+          <w:i/>
+          <w:color w:val="64748B"/>
+          <w:sz w:val="18"/>
         </w:rPr>
-        <w:t>[ TEMPEL SCREENSHOT: HASIL OUTPUT TEXT DUMP dd() DI BROWSER DI SINI ]</w:t>
+        <w:t>(Screenshot Tampilan dump data dd di Browser)</w:t>
       </w:r>
     </w:p>
     <w:p>

</xml_diff>

<commit_message>
Embed validation error screenshot into Task 3 Word report document
</commit_message>
<xml_diff>
--- a/Portfolio WP2/3_Unjuk_Kerja Melakukan Debugging - Nugraha Jody.docx
+++ b/Portfolio WP2/3_Unjuk_Kerja Melakukan Debugging - Nugraha Jody.docx
@@ -516,16 +516,56 @@
     </w:tbl>
     <w:p>
       <w:pPr>
-        <w:spacing w:before="160"/>
+        <w:spacing w:before="160" w:after="160"/>
+        <w:jc w:val="center"/>
+      </w:pPr>
+      <w:r>
+        <w:drawing>
+          <wp:inline xmlns:a="http://schemas.openxmlformats.org/drawingml/2006/main" xmlns:pic="http://schemas.openxmlformats.org/drawingml/2006/picture">
+            <wp:extent cx="4754880" cy="2558534"/>
+            <wp:docPr id="5" name="Picture 5"/>
+            <wp:cNvGraphicFramePr>
+              <a:graphicFrameLocks noChangeAspect="1"/>
+            </wp:cNvGraphicFramePr>
+            <a:graphic>
+              <a:graphicData uri="http://schemas.openxmlformats.org/drawingml/2006/picture">
+                <pic:pic>
+                  <pic:nvPicPr>
+                    <pic:cNvPr id="0" name="media__1783246840980.png"/>
+                    <pic:cNvPicPr/>
+                  </pic:nvPicPr>
+                  <pic:blipFill>
+                    <a:blip r:embed="rId13"/>
+                    <a:stretch>
+                      <a:fillRect/>
+                    </a:stretch>
+                  </pic:blipFill>
+                  <pic:spPr>
+                    <a:xfrm>
+                      <a:off x="0" y="0"/>
+                      <a:ext cx="4754880" cy="2558534"/>
+                    </a:xfrm>
+                    <a:prstGeom prst="rect"/>
+                  </pic:spPr>
+                </pic:pic>
+              </a:graphicData>
+            </a:graphic>
+          </wp:inline>
+        </w:drawing>
+      </w:r>
+    </w:p>
+    <w:p>
+      <w:pPr>
         <w:jc w:val="center"/>
       </w:pPr>
       <w:r>
         <w:rPr>
           <w:rFonts w:ascii="Arial" w:hAnsi="Arial"/>
-          <w:b/>
-          <w:color w:val="EF4444"/>
+          <w:i/>
+          <w:color w:val="64748B"/>
+          <w:sz w:val="18"/>
         </w:rPr>
-        <w:t>[ TEMPEL SCREENSHOT: FORM ERROR / KODE TYPO DI VS CODE DI SINI ]</w:t>
+        <w:t>(Screenshot Kode Validasi Eror Typo di VS Code)</w:t>
       </w:r>
     </w:p>
     <w:p>
@@ -582,7 +622,7 @@
     </w:tbl>
     <w:p>
       <w:pPr>
-        <w:spacing w:before="160"/>
+        <w:spacing w:before="160" w:after="160"/>
         <w:jc w:val="center"/>
       </w:pPr>
       <w:r>

</xml_diff>

<commit_message>
Embed corrected code screenshot into Task 3 Word report document
</commit_message>
<xml_diff>
--- a/Portfolio WP2/3_Unjuk_Kerja Melakukan Debugging - Nugraha Jody.docx
+++ b/Portfolio WP2/3_Unjuk_Kerja Melakukan Debugging - Nugraha Jody.docx
@@ -626,12 +626,52 @@
         <w:jc w:val="center"/>
       </w:pPr>
       <w:r>
+        <w:drawing>
+          <wp:inline xmlns:a="http://schemas.openxmlformats.org/drawingml/2006/main" xmlns:pic="http://schemas.openxmlformats.org/drawingml/2006/picture">
+            <wp:extent cx="4754880" cy="2549247"/>
+            <wp:docPr id="6" name="Picture 6"/>
+            <wp:cNvGraphicFramePr>
+              <a:graphicFrameLocks noChangeAspect="1"/>
+            </wp:cNvGraphicFramePr>
+            <a:graphic>
+              <a:graphicData uri="http://schemas.openxmlformats.org/drawingml/2006/picture">
+                <pic:pic>
+                  <pic:nvPicPr>
+                    <pic:cNvPr id="0" name="media__1783246978372.png"/>
+                    <pic:cNvPicPr/>
+                  </pic:nvPicPr>
+                  <pic:blipFill>
+                    <a:blip r:embed="rId14"/>
+                    <a:stretch>
+                      <a:fillRect/>
+                    </a:stretch>
+                  </pic:blipFill>
+                  <pic:spPr>
+                    <a:xfrm>
+                      <a:off x="0" y="0"/>
+                      <a:ext cx="4754880" cy="2549247"/>
+                    </a:xfrm>
+                    <a:prstGeom prst="rect"/>
+                  </pic:spPr>
+                </pic:pic>
+              </a:graphicData>
+            </a:graphic>
+          </wp:inline>
+        </w:drawing>
+      </w:r>
+    </w:p>
+    <w:p>
+      <w:pPr>
+        <w:jc w:val="center"/>
+      </w:pPr>
+      <w:r>
         <w:rPr>
           <w:rFonts w:ascii="Arial" w:hAnsi="Arial"/>
-          <w:b/>
-          <w:color w:val="EF4444"/>
+          <w:i/>
+          <w:color w:val="64748B"/>
+          <w:sz w:val="18"/>
         </w:rPr>
-        <w:t>[ TEMPEL SCREENSHOT: KODE SETELAH DIPERBAIKI DI VS CODE DI SINI ]</w:t>
+        <w:t>(Screenshot Kode Validasi Diperbaiki di VS Code)</w:t>
       </w:r>
     </w:p>
     <w:p>

</xml_diff>

<commit_message>
Complete Task 3 Word report document with all debugging screenshots embedded
</commit_message>
<xml_diff>
--- a/Portfolio WP2/3_Unjuk_Kerja Melakukan Debugging - Nugraha Jody.docx
+++ b/Portfolio WP2/3_Unjuk_Kerja Melakukan Debugging - Nugraha Jody.docx
@@ -680,12 +680,52 @@
         <w:jc w:val="center"/>
       </w:pPr>
       <w:r>
+        <w:drawing>
+          <wp:inline xmlns:a="http://schemas.openxmlformats.org/drawingml/2006/main" xmlns:pic="http://schemas.openxmlformats.org/drawingml/2006/picture">
+            <wp:extent cx="4754880" cy="2512100"/>
+            <wp:docPr id="7" name="Picture 7"/>
+            <wp:cNvGraphicFramePr>
+              <a:graphicFrameLocks noChangeAspect="1"/>
+            </wp:cNvGraphicFramePr>
+            <a:graphic>
+              <a:graphicData uri="http://schemas.openxmlformats.org/drawingml/2006/picture">
+                <pic:pic>
+                  <pic:nvPicPr>
+                    <pic:cNvPr id="0" name="media__1783247067294.png"/>
+                    <pic:cNvPicPr/>
+                  </pic:nvPicPr>
+                  <pic:blipFill>
+                    <a:blip r:embed="rId15"/>
+                    <a:stretch>
+                      <a:fillRect/>
+                    </a:stretch>
+                  </pic:blipFill>
+                  <pic:spPr>
+                    <a:xfrm>
+                      <a:off x="0" y="0"/>
+                      <a:ext cx="4754880" cy="2512100"/>
+                    </a:xfrm>
+                    <a:prstGeom prst="rect"/>
+                  </pic:spPr>
+                </pic:pic>
+              </a:graphicData>
+            </a:graphic>
+          </wp:inline>
+        </w:drawing>
+      </w:r>
+    </w:p>
+    <w:p>
+      <w:pPr>
+        <w:jc w:val="center"/>
+      </w:pPr>
+      <w:r>
         <w:rPr>
           <w:rFonts w:ascii="Arial" w:hAnsi="Arial"/>
-          <w:b/>
-          <w:color w:val="EF4444"/>
+          <w:i/>
+          <w:color w:val="64748B"/>
+          <w:sz w:val="18"/>
         </w:rPr>
-        <w:t>[ TEMPEL SCREENSHOT: BROWSER DAFTAR MEKANIK AKTIF SETELAH BERHASIL DISIMPAN DI SINI ]</w:t>
+        <w:t>(Screenshot Daftar Mekanik Aktif di Browser)</w:t>
       </w:r>
     </w:p>
     <w:sectPr>

</xml_diff>